<commit_message>
WIP-19.7 rebuild complete objections and sync Word
</commit_message>
<xml_diff>
--- a/editable_docx/03_Ходатайство_об_истребовании_доказательств.docx
+++ b/editable_docx/03_Ходатайство_об_истребовании_доказательств.docx
@@ -2362,6 +2362,36 @@
     </w:p>
     <w:p>
       <w:pPr>
+        <w:pStyle w:val="Heading3"/>
+      </w:pPr>
+      <w:r>
+        <w:rPr>
+          <w:rFonts w:ascii="Times New Roman" w:hAnsi="Times New Roman" w:cs="Times New Roman" w:eastAsia="Times New Roman"/>
+          <w:b/>
+          <w:i w:val="0"/>
+          <w:color w:val="000000"/>
+          <w:sz w:val="23"/>
+        </w:rPr>
+        <w:t>Прямое возмещение убытков</w:t>
+      </w:r>
+    </w:p>
+    <w:p>
+      <w:pPr>
+        <w:ind w:firstLine="709"/>
+      </w:pPr>
+      <w:r>
+        <w:rPr>
+          <w:rFonts w:ascii="Times New Roman" w:hAnsi="Times New Roman" w:cs="Times New Roman" w:eastAsia="Times New Roman"/>
+          <w:b w:val="0"/>
+          <w:i w:val="0"/>
+          <w:color w:val="000000"/>
+          <w:sz w:val="22"/>
+        </w:rPr>
+        <w:t>Если полис ХХХ 0284409797 является полисом ОСАГО автомобиля истца и выполнены условия ст. 14.1 Закона об ОСАГО, необходимо установить, обращалось ли ООО «ВИГОРАВТО» за прямым возмещением убытков к своему страховщику. Вид указанного полиса заранее не утверждается.</w:t>
+      </w:r>
+    </w:p>
+    <w:p>
+      <w:pPr>
         <w:pStyle w:val="Heading2"/>
       </w:pPr>
       <w:r>
@@ -2564,7 +2594,7 @@
           <w:color w:val="000000"/>
           <w:sz w:val="22"/>
         </w:rPr>
-        <w:t>содержание первоначально указанных повреждений;</w:t>
+        <w:t>сведения о разногласиях участников;</w:t>
       </w:r>
     </w:p>
     <w:p>
@@ -2589,7 +2619,7 @@
           <w:color w:val="000000"/>
           <w:sz w:val="22"/>
         </w:rPr>
-        <w:t>материалы N231029-18673;</w:t>
+        <w:t>сведения о применённом лимите 100 000 или 400 000 руб.;</w:t>
       </w:r>
     </w:p>
     <w:p>
@@ -2614,6 +2644,81 @@
           <w:color w:val="000000"/>
           <w:sz w:val="22"/>
         </w:rPr>
+        <w:t>сведения о передаче извещения и фотофиксации в АИС ОСАГО;</w:t>
+      </w:r>
+    </w:p>
+    <w:p>
+      <w:pPr>
+        <w:spacing w:after="40"/>
+        <w:ind w:left="510" w:hanging="227"/>
+        <w:jc w:val="both"/>
+      </w:pPr>
+      <w:r>
+        <w:rPr>
+          <w:rFonts w:ascii="Times New Roman" w:hAnsi="Times New Roman" w:cs="Times New Roman" w:eastAsia="Times New Roman"/>
+          <w:color w:val="000000"/>
+          <w:sz w:val="22"/>
+        </w:rPr>
+        <w:t xml:space="preserve">• </w:t>
+      </w:r>
+      <w:r>
+        <w:rPr>
+          <w:rFonts w:ascii="Times New Roman" w:hAnsi="Times New Roman" w:cs="Times New Roman" w:eastAsia="Times New Roman"/>
+          <w:b w:val="0"/>
+          <w:i w:val="0"/>
+          <w:color w:val="000000"/>
+          <w:sz w:val="22"/>
+        </w:rPr>
+        <w:t>содержание первоначально указанных повреждений;</w:t>
+      </w:r>
+    </w:p>
+    <w:p>
+      <w:pPr>
+        <w:spacing w:after="40"/>
+        <w:ind w:left="510" w:hanging="227"/>
+        <w:jc w:val="both"/>
+      </w:pPr>
+      <w:r>
+        <w:rPr>
+          <w:rFonts w:ascii="Times New Roman" w:hAnsi="Times New Roman" w:cs="Times New Roman" w:eastAsia="Times New Roman"/>
+          <w:color w:val="000000"/>
+          <w:sz w:val="22"/>
+        </w:rPr>
+        <w:t xml:space="preserve">• </w:t>
+      </w:r>
+      <w:r>
+        <w:rPr>
+          <w:rFonts w:ascii="Times New Roman" w:hAnsi="Times New Roman" w:cs="Times New Roman" w:eastAsia="Times New Roman"/>
+          <w:b w:val="0"/>
+          <w:i w:val="0"/>
+          <w:color w:val="000000"/>
+          <w:sz w:val="22"/>
+        </w:rPr>
+        <w:t>материалы N231029-18673;</w:t>
+      </w:r>
+    </w:p>
+    <w:p>
+      <w:pPr>
+        <w:spacing w:after="40"/>
+        <w:ind w:left="510" w:hanging="227"/>
+        <w:jc w:val="both"/>
+      </w:pPr>
+      <w:r>
+        <w:rPr>
+          <w:rFonts w:ascii="Times New Roman" w:hAnsi="Times New Roman" w:cs="Times New Roman" w:eastAsia="Times New Roman"/>
+          <w:color w:val="000000"/>
+          <w:sz w:val="22"/>
+        </w:rPr>
+        <w:t xml:space="preserve">• </w:t>
+      </w:r>
+      <w:r>
+        <w:rPr>
+          <w:rFonts w:ascii="Times New Roman" w:hAnsi="Times New Roman" w:cs="Times New Roman" w:eastAsia="Times New Roman"/>
+          <w:b w:val="0"/>
+          <w:i w:val="0"/>
+          <w:color w:val="000000"/>
+          <w:sz w:val="22"/>
+        </w:rPr>
         <w:t>материалы фотофиксации 347490.</w:t>
       </w:r>
     </w:p>
@@ -2913,7 +3018,7 @@
           <w:color w:val="000000"/>
           <w:sz w:val="22"/>
         </w:rPr>
-        <w:t>дефектовки;</w:t>
+        <w:t>счета;</w:t>
       </w:r>
     </w:p>
     <w:p>
@@ -2938,7 +3043,7 @@
           <w:color w:val="000000"/>
           <w:sz w:val="22"/>
         </w:rPr>
-        <w:t>сведения о последующих страховых событиях;</w:t>
+        <w:t>акты выполненных работ;</w:t>
       </w:r>
     </w:p>
     <w:p>
@@ -2963,7 +3068,7 @@
           <w:color w:val="000000"/>
           <w:sz w:val="22"/>
         </w:rPr>
-        <w:t>текущее состояние;</w:t>
+        <w:t>даты ремонта;</w:t>
       </w:r>
     </w:p>
     <w:p>
@@ -2988,7 +3093,7 @@
           <w:color w:val="000000"/>
           <w:sz w:val="22"/>
         </w:rPr>
-        <w:t>текущий пробег;</w:t>
+        <w:t>перечень фактически заменённых деталей;</w:t>
       </w:r>
     </w:p>
     <w:p>
@@ -3013,7 +3118,7 @@
           <w:color w:val="000000"/>
           <w:sz w:val="22"/>
         </w:rPr>
-        <w:t>место нахождения автомобиля;</w:t>
+        <w:t>дефектовки;</w:t>
       </w:r>
     </w:p>
     <w:p>
@@ -3038,7 +3143,7 @@
           <w:color w:val="000000"/>
           <w:sz w:val="22"/>
         </w:rPr>
-        <w:t>возможность предоставить автомобиль для экспертизы.</w:t>
+        <w:t>сведения о последующих страховых событиях;</w:t>
       </w:r>
     </w:p>
     <w:p>
@@ -3063,7 +3168,7 @@
           <w:color w:val="000000"/>
           <w:sz w:val="22"/>
         </w:rPr>
-        <w:t>полис ХХХ 0284409797, указанный в иске;</w:t>
+        <w:t>текущее состояние;</w:t>
       </w:r>
     </w:p>
     <w:p>
@@ -3088,7 +3193,7 @@
           <w:color w:val="000000"/>
           <w:sz w:val="22"/>
         </w:rPr>
-        <w:t>сведения о страховщике, виде страхования, страхователе, застрахованном ТС и сроке действия этого полиса;</w:t>
+        <w:t>текущий пробег;</w:t>
       </w:r>
     </w:p>
     <w:p>
@@ -3113,7 +3218,207 @@
           <w:color w:val="000000"/>
           <w:sz w:val="22"/>
         </w:rPr>
+        <w:t>место нахождения автомобиля;</w:t>
+      </w:r>
+    </w:p>
+    <w:p>
+      <w:pPr>
+        <w:spacing w:after="40"/>
+        <w:ind w:left="510" w:hanging="227"/>
+        <w:jc w:val="both"/>
+      </w:pPr>
+      <w:r>
+        <w:rPr>
+          <w:rFonts w:ascii="Times New Roman" w:hAnsi="Times New Roman" w:cs="Times New Roman" w:eastAsia="Times New Roman"/>
+          <w:color w:val="000000"/>
+          <w:sz w:val="22"/>
+        </w:rPr>
+        <w:t xml:space="preserve">• </w:t>
+      </w:r>
+      <w:r>
+        <w:rPr>
+          <w:rFonts w:ascii="Times New Roman" w:hAnsi="Times New Roman" w:cs="Times New Roman" w:eastAsia="Times New Roman"/>
+          <w:b w:val="0"/>
+          <w:i w:val="0"/>
+          <w:color w:val="000000"/>
+          <w:sz w:val="22"/>
+        </w:rPr>
+        <w:t>возможность предоставить автомобиль для экспертизы.</w:t>
+      </w:r>
+    </w:p>
+    <w:p>
+      <w:pPr>
+        <w:spacing w:after="40"/>
+        <w:ind w:left="510" w:hanging="227"/>
+        <w:jc w:val="both"/>
+      </w:pPr>
+      <w:r>
+        <w:rPr>
+          <w:rFonts w:ascii="Times New Roman" w:hAnsi="Times New Roman" w:cs="Times New Roman" w:eastAsia="Times New Roman"/>
+          <w:color w:val="000000"/>
+          <w:sz w:val="22"/>
+        </w:rPr>
+        <w:t xml:space="preserve">• </w:t>
+      </w:r>
+      <w:r>
+        <w:rPr>
+          <w:rFonts w:ascii="Times New Roman" w:hAnsi="Times New Roman" w:cs="Times New Roman" w:eastAsia="Times New Roman"/>
+          <w:b w:val="0"/>
+          <w:i w:val="0"/>
+          <w:color w:val="000000"/>
+          <w:sz w:val="22"/>
+        </w:rPr>
+        <w:t>полис ХХХ 0284409797, указанный в иске;</w:t>
+      </w:r>
+    </w:p>
+    <w:p>
+      <w:pPr>
+        <w:spacing w:after="40"/>
+        <w:ind w:left="510" w:hanging="227"/>
+        <w:jc w:val="both"/>
+      </w:pPr>
+      <w:r>
+        <w:rPr>
+          <w:rFonts w:ascii="Times New Roman" w:hAnsi="Times New Roman" w:cs="Times New Roman" w:eastAsia="Times New Roman"/>
+          <w:color w:val="000000"/>
+          <w:sz w:val="22"/>
+        </w:rPr>
+        <w:t xml:space="preserve">• </w:t>
+      </w:r>
+      <w:r>
+        <w:rPr>
+          <w:rFonts w:ascii="Times New Roman" w:hAnsi="Times New Roman" w:cs="Times New Roman" w:eastAsia="Times New Roman"/>
+          <w:b w:val="0"/>
+          <w:i w:val="0"/>
+          <w:color w:val="000000"/>
+          <w:sz w:val="22"/>
+        </w:rPr>
+        <w:t>сведения о страховщике, виде страхования, страхователе, застрахованном ТС и сроке действия этого полиса;</w:t>
+      </w:r>
+    </w:p>
+    <w:p>
+      <w:pPr>
+        <w:spacing w:after="40"/>
+        <w:ind w:left="510" w:hanging="227"/>
+        <w:jc w:val="both"/>
+      </w:pPr>
+      <w:r>
+        <w:rPr>
+          <w:rFonts w:ascii="Times New Roman" w:hAnsi="Times New Roman" w:cs="Times New Roman" w:eastAsia="Times New Roman"/>
+          <w:color w:val="000000"/>
+          <w:sz w:val="22"/>
+        </w:rPr>
+        <w:t xml:space="preserve">• </w:t>
+      </w:r>
+      <w:r>
+        <w:rPr>
+          <w:rFonts w:ascii="Times New Roman" w:hAnsi="Times New Roman" w:cs="Times New Roman" w:eastAsia="Times New Roman"/>
+          <w:b w:val="0"/>
+          <w:i w:val="0"/>
+          <w:color w:val="000000"/>
+          <w:sz w:val="22"/>
+        </w:rPr>
         <w:t>пояснение о связи полиса ХХХ 0284409797 с договором КАСКО № 65/22-04(7)-000217 и выплатным делом № 065/23-04-001505.</w:t>
+      </w:r>
+    </w:p>
+    <w:p>
+      <w:pPr>
+        <w:spacing w:after="40"/>
+        <w:ind w:left="510" w:hanging="227"/>
+        <w:jc w:val="both"/>
+      </w:pPr>
+      <w:r>
+        <w:rPr>
+          <w:rFonts w:ascii="Times New Roman" w:hAnsi="Times New Roman" w:cs="Times New Roman" w:eastAsia="Times New Roman"/>
+          <w:color w:val="000000"/>
+          <w:sz w:val="22"/>
+        </w:rPr>
+        <w:t xml:space="preserve">• </w:t>
+      </w:r>
+      <w:r>
+        <w:rPr>
+          <w:rFonts w:ascii="Times New Roman" w:hAnsi="Times New Roman" w:cs="Times New Roman" w:eastAsia="Times New Roman"/>
+          <w:b w:val="0"/>
+          <w:i w:val="0"/>
+          <w:color w:val="000000"/>
+          <w:sz w:val="22"/>
+        </w:rPr>
+        <w:t>полный договор на юридические услуги и приложения;</w:t>
+      </w:r>
+    </w:p>
+    <w:p>
+      <w:pPr>
+        <w:spacing w:after="40"/>
+        <w:ind w:left="510" w:hanging="227"/>
+        <w:jc w:val="both"/>
+      </w:pPr>
+      <w:r>
+        <w:rPr>
+          <w:rFonts w:ascii="Times New Roman" w:hAnsi="Times New Roman" w:cs="Times New Roman" w:eastAsia="Times New Roman"/>
+          <w:color w:val="000000"/>
+          <w:sz w:val="22"/>
+        </w:rPr>
+        <w:t xml:space="preserve">• </w:t>
+      </w:r>
+      <w:r>
+        <w:rPr>
+          <w:rFonts w:ascii="Times New Roman" w:hAnsi="Times New Roman" w:cs="Times New Roman" w:eastAsia="Times New Roman"/>
+          <w:b w:val="0"/>
+          <w:i w:val="0"/>
+          <w:color w:val="000000"/>
+          <w:sz w:val="22"/>
+        </w:rPr>
+        <w:t>акт оказанных услуг, если он составлялся;</w:t>
+      </w:r>
+    </w:p>
+    <w:p>
+      <w:pPr>
+        <w:spacing w:after="40"/>
+        <w:ind w:left="510" w:hanging="227"/>
+        <w:jc w:val="both"/>
+      </w:pPr>
+      <w:r>
+        <w:rPr>
+          <w:rFonts w:ascii="Times New Roman" w:hAnsi="Times New Roman" w:cs="Times New Roman" w:eastAsia="Times New Roman"/>
+          <w:color w:val="000000"/>
+          <w:sz w:val="22"/>
+        </w:rPr>
+        <w:t xml:space="preserve">• </w:t>
+      </w:r>
+      <w:r>
+        <w:rPr>
+          <w:rFonts w:ascii="Times New Roman" w:hAnsi="Times New Roman" w:cs="Times New Roman" w:eastAsia="Times New Roman"/>
+          <w:b w:val="0"/>
+          <w:i w:val="0"/>
+          <w:color w:val="000000"/>
+          <w:sz w:val="22"/>
+        </w:rPr>
+        <w:t>перечень фактически выполненных юридических работ;</w:t>
+      </w:r>
+    </w:p>
+    <w:p>
+      <w:pPr>
+        <w:spacing w:after="40"/>
+        <w:ind w:left="510" w:hanging="227"/>
+        <w:jc w:val="both"/>
+      </w:pPr>
+      <w:r>
+        <w:rPr>
+          <w:rFonts w:ascii="Times New Roman" w:hAnsi="Times New Roman" w:cs="Times New Roman" w:eastAsia="Times New Roman"/>
+          <w:color w:val="000000"/>
+          <w:sz w:val="22"/>
+        </w:rPr>
+        <w:t xml:space="preserve">• </w:t>
+      </w:r>
+      <w:r>
+        <w:rPr>
+          <w:rFonts w:ascii="Times New Roman" w:hAnsi="Times New Roman" w:cs="Times New Roman" w:eastAsia="Times New Roman"/>
+          <w:b w:val="0"/>
+          <w:i w:val="0"/>
+          <w:color w:val="000000"/>
+          <w:sz w:val="22"/>
+        </w:rPr>
+        <w:t>сведения об относимости расходов 50 000 руб. именно к настоящему делу.</w:t>
       </w:r>
     </w:p>
     <w:p>
@@ -3145,7 +3450,7 @@
           <w:color w:val="000000"/>
           <w:sz w:val="22"/>
         </w:rPr>
-        <w:t>Ремонтировался ли автомобиль после ДТП, какие работы выполнялись, сохранилось ли исходное состояние, можно ли провести натурное исследование и какова связь полиса ХХХ 0284409797 с договором КАСКО и выплатным делом.</w:t>
+        <w:t>Ремонтировался ли автомобиль после ДТП, какие работы и замены выполнялись, сохранилось ли исходное состояние, можно ли провести натурное исследование, какова связь полиса ХХХ 0284409797 с договором КАСКО и выплатным делом и какие юридические услуги фактически оказаны.</w:t>
       </w:r>
     </w:p>
     <w:p>
@@ -3177,7 +3482,7 @@
           <w:color w:val="000000"/>
           <w:sz w:val="22"/>
         </w:rPr>
-        <w:t>Эти сведения необходимы для проверки причинной связи, повторности повреждений и фактической основы заключения 2026 года.</w:t>
+        <w:t>Отсутствие фактического ремонта само по себе не исключает наличие ущерба. Сведения о ремонте необходимы для проверки причинной связи, повторности повреждений, текущего состояния, возможности натурной экспертизы и того, какие детали фактически заменялись.</w:t>
       </w:r>
     </w:p>
     <w:p>
@@ -3320,22 +3625,7 @@
           <w:color w:val="000000"/>
           <w:sz w:val="25"/>
         </w:rPr>
-        <w:t>5. УГИБДД ГУ МВД России по г. Москве</w:t>
-      </w:r>
-    </w:p>
-    <w:p>
-      <w:pPr>
-        <w:ind w:firstLine="709"/>
-      </w:pPr>
-      <w:r>
-        <w:rPr>
-          <w:rFonts w:ascii="Times New Roman" w:hAnsi="Times New Roman" w:cs="Times New Roman" w:eastAsia="Times New Roman"/>
-          <w:b w:val="0"/>
-          <w:i w:val="0"/>
-          <w:color w:val="000000"/>
-          <w:sz w:val="22"/>
-        </w:rPr>
-        <w:t>Ответчик не утверждает, что спорные повреждения возникли в другом ДТП. История иных событий запрашивается как исходный материал для проверки причинной связи.</w:t>
+        <w:t>5. Истец / Левинский - полный комплект заключения 2026 года</w:t>
       </w:r>
     </w:p>
     <w:p>
@@ -3377,7 +3667,7 @@
           <w:color w:val="000000"/>
           <w:sz w:val="22"/>
         </w:rPr>
-        <w:t>сведения о зарегистрированных ДТП с участием Volkswagen Polo VIN XW8ZZZ61ZLG032867 до 29.10.2023 - для проверки ранее существовавших повреждений задней части автомобиля;</w:t>
+        <w:t>заключение от 07.08.2026 полностью, без пропуска страниц;</w:t>
       </w:r>
     </w:p>
     <w:p>
@@ -3402,7 +3692,7 @@
           <w:color w:val="000000"/>
           <w:sz w:val="22"/>
         </w:rPr>
-        <w:t>сведения о зарегистрированных ДТП с участием того же автомобиля с 29.10.2023 по 07.08.2026 - для проверки последующих повреждающих событий до заключения Левинского;</w:t>
+        <w:t>приложение №1 полностью;</w:t>
       </w:r>
     </w:p>
     <w:p>
@@ -3427,7 +3717,232 @@
           <w:color w:val="000000"/>
           <w:sz w:val="22"/>
         </w:rPr>
-        <w:t>при наличии зарегистрированных ДТП, в которых фиксировались повреждения задней части указанного автомобиля, - материалы фиксации соответствующих повреждений.</w:t>
+        <w:t>все остальные приложения к заключению;</w:t>
+      </w:r>
+    </w:p>
+    <w:p>
+      <w:pPr>
+        <w:spacing w:after="40"/>
+        <w:ind w:left="510" w:hanging="227"/>
+        <w:jc w:val="both"/>
+      </w:pPr>
+      <w:r>
+        <w:rPr>
+          <w:rFonts w:ascii="Times New Roman" w:hAnsi="Times New Roman" w:cs="Times New Roman" w:eastAsia="Times New Roman"/>
+          <w:color w:val="000000"/>
+          <w:sz w:val="22"/>
+        </w:rPr>
+        <w:t xml:space="preserve">• </w:t>
+      </w:r>
+      <w:r>
+        <w:rPr>
+          <w:rFonts w:ascii="Times New Roman" w:hAnsi="Times New Roman" w:cs="Times New Roman" w:eastAsia="Times New Roman"/>
+          <w:b w:val="0"/>
+          <w:i w:val="0"/>
+          <w:color w:val="000000"/>
+          <w:sz w:val="22"/>
+        </w:rPr>
+        <w:t>полный построчный расчёт;</w:t>
+      </w:r>
+    </w:p>
+    <w:p>
+      <w:pPr>
+        <w:spacing w:after="40"/>
+        <w:ind w:left="510" w:hanging="227"/>
+        <w:jc w:val="both"/>
+      </w:pPr>
+      <w:r>
+        <w:rPr>
+          <w:rFonts w:ascii="Times New Roman" w:hAnsi="Times New Roman" w:cs="Times New Roman" w:eastAsia="Times New Roman"/>
+          <w:color w:val="000000"/>
+          <w:sz w:val="22"/>
+        </w:rPr>
+        <w:t xml:space="preserve">• </w:t>
+      </w:r>
+      <w:r>
+        <w:rPr>
+          <w:rFonts w:ascii="Times New Roman" w:hAnsi="Times New Roman" w:cs="Times New Roman" w:eastAsia="Times New Roman"/>
+          <w:b w:val="0"/>
+          <w:i w:val="0"/>
+          <w:color w:val="000000"/>
+          <w:sz w:val="22"/>
+        </w:rPr>
+        <w:t>все источники цен;</w:t>
+      </w:r>
+    </w:p>
+    <w:p>
+      <w:pPr>
+        <w:spacing w:after="40"/>
+        <w:ind w:left="510" w:hanging="227"/>
+        <w:jc w:val="both"/>
+      </w:pPr>
+      <w:r>
+        <w:rPr>
+          <w:rFonts w:ascii="Times New Roman" w:hAnsi="Times New Roman" w:cs="Times New Roman" w:eastAsia="Times New Roman"/>
+          <w:color w:val="000000"/>
+          <w:sz w:val="22"/>
+        </w:rPr>
+        <w:t xml:space="preserve">• </w:t>
+      </w:r>
+      <w:r>
+        <w:rPr>
+          <w:rFonts w:ascii="Times New Roman" w:hAnsi="Times New Roman" w:cs="Times New Roman" w:eastAsia="Times New Roman"/>
+          <w:b w:val="0"/>
+          <w:i w:val="0"/>
+          <w:color w:val="000000"/>
+          <w:sz w:val="22"/>
+        </w:rPr>
+        <w:t>распечатки и скриншоты ценовых предложений;</w:t>
+      </w:r>
+    </w:p>
+    <w:p>
+      <w:pPr>
+        <w:spacing w:after="40"/>
+        <w:ind w:left="510" w:hanging="227"/>
+        <w:jc w:val="both"/>
+      </w:pPr>
+      <w:r>
+        <w:rPr>
+          <w:rFonts w:ascii="Times New Roman" w:hAnsi="Times New Roman" w:cs="Times New Roman" w:eastAsia="Times New Roman"/>
+          <w:color w:val="000000"/>
+          <w:sz w:val="22"/>
+        </w:rPr>
+        <w:t xml:space="preserve">• </w:t>
+      </w:r>
+      <w:r>
+        <w:rPr>
+          <w:rFonts w:ascii="Times New Roman" w:hAnsi="Times New Roman" w:cs="Times New Roman" w:eastAsia="Times New Roman"/>
+          <w:b w:val="0"/>
+          <w:i w:val="0"/>
+          <w:color w:val="000000"/>
+          <w:sz w:val="22"/>
+        </w:rPr>
+        <w:t>дата получения каждой цены;</w:t>
+      </w:r>
+    </w:p>
+    <w:p>
+      <w:pPr>
+        <w:spacing w:after="40"/>
+        <w:ind w:left="510" w:hanging="227"/>
+        <w:jc w:val="both"/>
+      </w:pPr>
+      <w:r>
+        <w:rPr>
+          <w:rFonts w:ascii="Times New Roman" w:hAnsi="Times New Roman" w:cs="Times New Roman" w:eastAsia="Times New Roman"/>
+          <w:color w:val="000000"/>
+          <w:sz w:val="22"/>
+        </w:rPr>
+        <w:t xml:space="preserve">• </w:t>
+      </w:r>
+      <w:r>
+        <w:rPr>
+          <w:rFonts w:ascii="Times New Roman" w:hAnsi="Times New Roman" w:cs="Times New Roman" w:eastAsia="Times New Roman"/>
+          <w:b w:val="0"/>
+          <w:i w:val="0"/>
+          <w:color w:val="000000"/>
+          <w:sz w:val="22"/>
+        </w:rPr>
+        <w:t>материалы, переданные Левинскому заказчиком;</w:t>
+      </w:r>
+    </w:p>
+    <w:p>
+      <w:pPr>
+        <w:spacing w:after="40"/>
+        <w:ind w:left="510" w:hanging="227"/>
+        <w:jc w:val="both"/>
+      </w:pPr>
+      <w:r>
+        <w:rPr>
+          <w:rFonts w:ascii="Times New Roman" w:hAnsi="Times New Roman" w:cs="Times New Roman" w:eastAsia="Times New Roman"/>
+          <w:color w:val="000000"/>
+          <w:sz w:val="22"/>
+        </w:rPr>
+        <w:t xml:space="preserve">• </w:t>
+      </w:r>
+      <w:r>
+        <w:rPr>
+          <w:rFonts w:ascii="Times New Roman" w:hAnsi="Times New Roman" w:cs="Times New Roman" w:eastAsia="Times New Roman"/>
+          <w:b w:val="0"/>
+          <w:i w:val="0"/>
+          <w:color w:val="000000"/>
+          <w:sz w:val="22"/>
+        </w:rPr>
+        <w:t>фотографии;</w:t>
+      </w:r>
+    </w:p>
+    <w:p>
+      <w:pPr>
+        <w:spacing w:after="40"/>
+        <w:ind w:left="510" w:hanging="227"/>
+        <w:jc w:val="both"/>
+      </w:pPr>
+      <w:r>
+        <w:rPr>
+          <w:rFonts w:ascii="Times New Roman" w:hAnsi="Times New Roman" w:cs="Times New Roman" w:eastAsia="Times New Roman"/>
+          <w:color w:val="000000"/>
+          <w:sz w:val="22"/>
+        </w:rPr>
+        <w:t xml:space="preserve">• </w:t>
+      </w:r>
+      <w:r>
+        <w:rPr>
+          <w:rFonts w:ascii="Times New Roman" w:hAnsi="Times New Roman" w:cs="Times New Roman" w:eastAsia="Times New Roman"/>
+          <w:b w:val="0"/>
+          <w:i w:val="0"/>
+          <w:color w:val="000000"/>
+          <w:sz w:val="22"/>
+        </w:rPr>
+        <w:t>документы осмотра;</w:t>
+      </w:r>
+    </w:p>
+    <w:p>
+      <w:pPr>
+        <w:spacing w:after="40"/>
+        <w:ind w:left="510" w:hanging="227"/>
+        <w:jc w:val="both"/>
+      </w:pPr>
+      <w:r>
+        <w:rPr>
+          <w:rFonts w:ascii="Times New Roman" w:hAnsi="Times New Roman" w:cs="Times New Roman" w:eastAsia="Times New Roman"/>
+          <w:color w:val="000000"/>
+          <w:sz w:val="22"/>
+        </w:rPr>
+        <w:t xml:space="preserve">• </w:t>
+      </w:r>
+      <w:r>
+        <w:rPr>
+          <w:rFonts w:ascii="Times New Roman" w:hAnsi="Times New Roman" w:cs="Times New Roman" w:eastAsia="Times New Roman"/>
+          <w:b w:val="0"/>
+          <w:i w:val="0"/>
+          <w:color w:val="000000"/>
+          <w:sz w:val="22"/>
+        </w:rPr>
+        <w:t>договор и задание на исследование;</w:t>
+      </w:r>
+    </w:p>
+    <w:p>
+      <w:pPr>
+        <w:spacing w:after="40"/>
+        <w:ind w:left="510" w:hanging="227"/>
+        <w:jc w:val="both"/>
+      </w:pPr>
+      <w:r>
+        <w:rPr>
+          <w:rFonts w:ascii="Times New Roman" w:hAnsi="Times New Roman" w:cs="Times New Roman" w:eastAsia="Times New Roman"/>
+          <w:color w:val="000000"/>
+          <w:sz w:val="22"/>
+        </w:rPr>
+        <w:t xml:space="preserve">• </w:t>
+      </w:r>
+      <w:r>
+        <w:rPr>
+          <w:rFonts w:ascii="Times New Roman" w:hAnsi="Times New Roman" w:cs="Times New Roman" w:eastAsia="Times New Roman"/>
+          <w:b w:val="0"/>
+          <w:i w:val="0"/>
+          <w:color w:val="000000"/>
+          <w:sz w:val="22"/>
+        </w:rPr>
+        <w:t>документы, определяющие перечень поставленных вопросов.</w:t>
       </w:r>
     </w:p>
     <w:p>
@@ -3459,7 +3974,7 @@
           <w:color w:val="000000"/>
           <w:sz w:val="22"/>
         </w:rPr>
-        <w:t>Наличие или отсутствие иных зарегистрированных повреждающих событий, которые могли затрагивать спорные элементы задней части автомобиля.</w:t>
+        <w:t>Содержится ли в заключении самостоятельный ответ на вопрос №1 о составе и характере повреждений; какие данные и цены использованы; какие материалы переданы заказчиком; не перенесён ли перечень повреждений полностью из акта от 30.10.2023.</w:t>
       </w:r>
     </w:p>
     <w:p>
@@ -3491,7 +4006,7 @@
           <w:color w:val="000000"/>
           <w:sz w:val="22"/>
         </w:rPr>
-        <w:t>Сведения необходимы для последующей экспертной дифференциации происхождения десяти заявленных повреждений. Отсутствие иных ДТП также является значимым результатом проверки.</w:t>
+        <w:t>Заключение является основой расчёта 227 490,87 руб. Полнота его выводов, приложений и исходных данных влияет на возможность проверки объёма ущерба и причинной связи.</w:t>
       </w:r>
     </w:p>
     <w:p>
@@ -3523,7 +4038,7 @@
           <w:color w:val="000000"/>
           <w:sz w:val="22"/>
         </w:rPr>
-        <w:t>УГИБДД ГУ МВД России по г. Москве.</w:t>
+        <w:t>Истец и Левинский Н.К.</w:t>
       </w:r>
     </w:p>
     <w:p>
@@ -3555,7 +4070,7 @@
           <w:color w:val="000000"/>
           <w:sz w:val="22"/>
         </w:rPr>
-        <w:t>Обращение ID 6265336 от 19.10.2026.</w:t>
+        <w:t>В изученном комплекте выявлены только имеющиеся страницы и итоговые величины; полный комплект исходных приложений не представлен.</w:t>
       </w:r>
     </w:p>
     <w:p>
@@ -3587,7 +4102,7 @@
           <w:color w:val="000000"/>
           <w:sz w:val="22"/>
         </w:rPr>
-        <w:t>Ответом ГУ МВД России по г. Москве от 20.10.2026 № 3/267729720750 в предоставлении сведений отказано ввиду отсутствия у заявителя документального подтверждения права на их получение. Одновременно МВД прямо указало, что необходимые сведения и документы будут предоставлены по запросу уполномоченного должностного лица либо судьи.</w:t>
+        <w:t>Материалы исследования находятся у истца и автора заключения.</w:t>
       </w:r>
     </w:p>
     <w:p>
@@ -3619,7 +4134,7 @@
           <w:color w:val="000000"/>
           <w:sz w:val="22"/>
         </w:rPr>
-        <w:t>Истребовать указанные сведения и материалы у ГУ МВД России по г. Москве.</w:t>
+        <w:t>Истребовать полный комплект заключения, приложений, расчётов и исходных материалов либо предложить истцу представить их.</w:t>
       </w:r>
     </w:p>
     <w:p>
@@ -3634,7 +4149,321 @@
           <w:color w:val="000000"/>
           <w:sz w:val="25"/>
         </w:rPr>
-        <w:t>6. НСИС и РСА</w:t>
+        <w:t>6. УГИБДД ГУ МВД России по г. Москве</w:t>
+      </w:r>
+    </w:p>
+    <w:p>
+      <w:pPr>
+        <w:ind w:firstLine="709"/>
+      </w:pPr>
+      <w:r>
+        <w:rPr>
+          <w:rFonts w:ascii="Times New Roman" w:hAnsi="Times New Roman" w:cs="Times New Roman" w:eastAsia="Times New Roman"/>
+          <w:b w:val="0"/>
+          <w:i w:val="0"/>
+          <w:color w:val="000000"/>
+          <w:sz w:val="22"/>
+        </w:rPr>
+        <w:t>Ответчик не утверждает, что спорные повреждения возникли в другом ДТП. История иных событий запрашивается как исходный материал для проверки причинной связи.</w:t>
+      </w:r>
+    </w:p>
+    <w:p>
+      <w:pPr>
+        <w:spacing w:before="120"/>
+        <w:ind w:firstLine="0"/>
+        <w:jc w:val="left"/>
+      </w:pPr>
+      <w:r>
+        <w:rPr>
+          <w:rFonts w:ascii="Times New Roman" w:hAnsi="Times New Roman" w:cs="Times New Roman" w:eastAsia="Times New Roman"/>
+          <w:b/>
+          <w:i w:val="0"/>
+          <w:color w:val="000000"/>
+          <w:sz w:val="22"/>
+        </w:rPr>
+        <w:t>Какие доказательства истребуются:</w:t>
+      </w:r>
+    </w:p>
+    <w:p>
+      <w:pPr>
+        <w:spacing w:after="40"/>
+        <w:ind w:left="510" w:hanging="227"/>
+        <w:jc w:val="both"/>
+      </w:pPr>
+      <w:r>
+        <w:rPr>
+          <w:rFonts w:ascii="Times New Roman" w:hAnsi="Times New Roman" w:cs="Times New Roman" w:eastAsia="Times New Roman"/>
+          <w:color w:val="000000"/>
+          <w:sz w:val="22"/>
+        </w:rPr>
+        <w:t xml:space="preserve">• </w:t>
+      </w:r>
+      <w:r>
+        <w:rPr>
+          <w:rFonts w:ascii="Times New Roman" w:hAnsi="Times New Roman" w:cs="Times New Roman" w:eastAsia="Times New Roman"/>
+          <w:b w:val="0"/>
+          <w:i w:val="0"/>
+          <w:color w:val="000000"/>
+          <w:sz w:val="22"/>
+        </w:rPr>
+        <w:t>сведения о зарегистрированных ДТП с участием Volkswagen Polo VIN XW8ZZZ61ZLG032867 до 29.10.2023 - для проверки ранее существовавших повреждений задней части автомобиля;</w:t>
+      </w:r>
+    </w:p>
+    <w:p>
+      <w:pPr>
+        <w:spacing w:after="40"/>
+        <w:ind w:left="510" w:hanging="227"/>
+        <w:jc w:val="both"/>
+      </w:pPr>
+      <w:r>
+        <w:rPr>
+          <w:rFonts w:ascii="Times New Roman" w:hAnsi="Times New Roman" w:cs="Times New Roman" w:eastAsia="Times New Roman"/>
+          <w:color w:val="000000"/>
+          <w:sz w:val="22"/>
+        </w:rPr>
+        <w:t xml:space="preserve">• </w:t>
+      </w:r>
+      <w:r>
+        <w:rPr>
+          <w:rFonts w:ascii="Times New Roman" w:hAnsi="Times New Roman" w:cs="Times New Roman" w:eastAsia="Times New Roman"/>
+          <w:b w:val="0"/>
+          <w:i w:val="0"/>
+          <w:color w:val="000000"/>
+          <w:sz w:val="22"/>
+        </w:rPr>
+        <w:t>сведения о зарегистрированных ДТП с участием того же автомобиля с 29.10.2023 по 07.08.2026 - для проверки последующих повреждающих событий до заключения Левинского;</w:t>
+      </w:r>
+    </w:p>
+    <w:p>
+      <w:pPr>
+        <w:spacing w:after="40"/>
+        <w:ind w:left="510" w:hanging="227"/>
+        <w:jc w:val="both"/>
+      </w:pPr>
+      <w:r>
+        <w:rPr>
+          <w:rFonts w:ascii="Times New Roman" w:hAnsi="Times New Roman" w:cs="Times New Roman" w:eastAsia="Times New Roman"/>
+          <w:color w:val="000000"/>
+          <w:sz w:val="22"/>
+        </w:rPr>
+        <w:t xml:space="preserve">• </w:t>
+      </w:r>
+      <w:r>
+        <w:rPr>
+          <w:rFonts w:ascii="Times New Roman" w:hAnsi="Times New Roman" w:cs="Times New Roman" w:eastAsia="Times New Roman"/>
+          <w:b w:val="0"/>
+          <w:i w:val="0"/>
+          <w:color w:val="000000"/>
+          <w:sz w:val="22"/>
+        </w:rPr>
+        <w:t>при наличии зарегистрированных ДТП, в которых фиксировались повреждения задней части указанного автомобиля, - материалы фиксации соответствующих повреждений.</w:t>
+      </w:r>
+    </w:p>
+    <w:p>
+      <w:pPr>
+        <w:spacing w:before="120"/>
+        <w:ind w:firstLine="0"/>
+        <w:jc w:val="left"/>
+      </w:pPr>
+      <w:r>
+        <w:rPr>
+          <w:rFonts w:ascii="Times New Roman" w:hAnsi="Times New Roman" w:cs="Times New Roman" w:eastAsia="Times New Roman"/>
+          <w:b/>
+          <w:i w:val="0"/>
+          <w:color w:val="000000"/>
+          <w:sz w:val="22"/>
+        </w:rPr>
+        <w:t>Какое обстоятельство устанавливается:</w:t>
+      </w:r>
+    </w:p>
+    <w:p>
+      <w:pPr>
+        <w:ind w:firstLine="709"/>
+      </w:pPr>
+      <w:r>
+        <w:rPr>
+          <w:rFonts w:ascii="Times New Roman" w:hAnsi="Times New Roman" w:cs="Times New Roman" w:eastAsia="Times New Roman"/>
+          <w:b w:val="0"/>
+          <w:i w:val="0"/>
+          <w:color w:val="000000"/>
+          <w:sz w:val="22"/>
+        </w:rPr>
+        <w:t>Наличие или отсутствие иных зарегистрированных повреждающих событий, которые могли затрагивать спорные элементы задней части автомобиля.</w:t>
+      </w:r>
+    </w:p>
+    <w:p>
+      <w:pPr>
+        <w:spacing w:before="120"/>
+        <w:ind w:firstLine="0"/>
+        <w:jc w:val="left"/>
+      </w:pPr>
+      <w:r>
+        <w:rPr>
+          <w:rFonts w:ascii="Times New Roman" w:hAnsi="Times New Roman" w:cs="Times New Roman" w:eastAsia="Times New Roman"/>
+          <w:b/>
+          <w:i w:val="0"/>
+          <w:color w:val="000000"/>
+          <w:sz w:val="22"/>
+        </w:rPr>
+        <w:t>Значение для дела:</w:t>
+      </w:r>
+    </w:p>
+    <w:p>
+      <w:pPr>
+        <w:ind w:firstLine="709"/>
+      </w:pPr>
+      <w:r>
+        <w:rPr>
+          <w:rFonts w:ascii="Times New Roman" w:hAnsi="Times New Roman" w:cs="Times New Roman" w:eastAsia="Times New Roman"/>
+          <w:b w:val="0"/>
+          <w:i w:val="0"/>
+          <w:color w:val="000000"/>
+          <w:sz w:val="22"/>
+        </w:rPr>
+        <w:t>Сведения необходимы для последующей экспертной дифференциации происхождения десяти заявленных повреждений. Отсутствие иных ДТП также является значимым результатом проверки.</w:t>
+      </w:r>
+    </w:p>
+    <w:p>
+      <w:pPr>
+        <w:spacing w:before="120"/>
+        <w:ind w:firstLine="0"/>
+        <w:jc w:val="left"/>
+      </w:pPr>
+      <w:r>
+        <w:rPr>
+          <w:rFonts w:ascii="Times New Roman" w:hAnsi="Times New Roman" w:cs="Times New Roman" w:eastAsia="Times New Roman"/>
+          <w:b/>
+          <w:i w:val="0"/>
+          <w:color w:val="000000"/>
+          <w:sz w:val="22"/>
+        </w:rPr>
+        <w:t>У кого находится доказательство:</w:t>
+      </w:r>
+    </w:p>
+    <w:p>
+      <w:pPr>
+        <w:ind w:firstLine="709"/>
+      </w:pPr>
+      <w:r>
+        <w:rPr>
+          <w:rFonts w:ascii="Times New Roman" w:hAnsi="Times New Roman" w:cs="Times New Roman" w:eastAsia="Times New Roman"/>
+          <w:b w:val="0"/>
+          <w:i w:val="0"/>
+          <w:color w:val="000000"/>
+          <w:sz w:val="22"/>
+        </w:rPr>
+        <w:t>УГИБДД ГУ МВД России по г. Москве.</w:t>
+      </w:r>
+    </w:p>
+    <w:p>
+      <w:pPr>
+        <w:spacing w:before="120"/>
+        <w:ind w:firstLine="0"/>
+        <w:jc w:val="left"/>
+      </w:pPr>
+      <w:r>
+        <w:rPr>
+          <w:rFonts w:ascii="Times New Roman" w:hAnsi="Times New Roman" w:cs="Times New Roman" w:eastAsia="Times New Roman"/>
+          <w:b/>
+          <w:i w:val="0"/>
+          <w:color w:val="000000"/>
+          <w:sz w:val="22"/>
+        </w:rPr>
+        <w:t>Что предпринял ответчик:</w:t>
+      </w:r>
+    </w:p>
+    <w:p>
+      <w:pPr>
+        <w:ind w:firstLine="709"/>
+      </w:pPr>
+      <w:r>
+        <w:rPr>
+          <w:rFonts w:ascii="Times New Roman" w:hAnsi="Times New Roman" w:cs="Times New Roman" w:eastAsia="Times New Roman"/>
+          <w:b w:val="0"/>
+          <w:i w:val="0"/>
+          <w:color w:val="000000"/>
+          <w:sz w:val="22"/>
+        </w:rPr>
+        <w:t>Обращение ID 6265336 от 19.10.2026.</w:t>
+      </w:r>
+    </w:p>
+    <w:p>
+      <w:pPr>
+        <w:spacing w:before="120"/>
+        <w:ind w:firstLine="0"/>
+        <w:jc w:val="left"/>
+      </w:pPr>
+      <w:r>
+        <w:rPr>
+          <w:rFonts w:ascii="Times New Roman" w:hAnsi="Times New Roman" w:cs="Times New Roman" w:eastAsia="Times New Roman"/>
+          <w:b/>
+          <w:i w:val="0"/>
+          <w:color w:val="000000"/>
+          <w:sz w:val="22"/>
+        </w:rPr>
+        <w:t>Почему невозможно получить самостоятельно:</w:t>
+      </w:r>
+    </w:p>
+    <w:p>
+      <w:pPr>
+        <w:ind w:firstLine="709"/>
+      </w:pPr>
+      <w:r>
+        <w:rPr>
+          <w:rFonts w:ascii="Times New Roman" w:hAnsi="Times New Roman" w:cs="Times New Roman" w:eastAsia="Times New Roman"/>
+          <w:b w:val="0"/>
+          <w:i w:val="0"/>
+          <w:color w:val="000000"/>
+          <w:sz w:val="22"/>
+        </w:rPr>
+        <w:t>Ответом ГУ МВД России по г. Москве от 20.10.2026 № 3/267729720750 в предоставлении сведений отказано ввиду отсутствия у заявителя документального подтверждения права на их получение. Одновременно МВД прямо указало, что необходимые сведения и документы будут предоставлены по запросу уполномоченного должностного лица либо судьи.</w:t>
+      </w:r>
+    </w:p>
+    <w:p>
+      <w:pPr>
+        <w:spacing w:before="120"/>
+        <w:ind w:firstLine="0"/>
+        <w:jc w:val="left"/>
+      </w:pPr>
+      <w:r>
+        <w:rPr>
+          <w:rFonts w:ascii="Times New Roman" w:hAnsi="Times New Roman" w:cs="Times New Roman" w:eastAsia="Times New Roman"/>
+          <w:b/>
+          <w:i w:val="0"/>
+          <w:color w:val="000000"/>
+          <w:sz w:val="22"/>
+        </w:rPr>
+        <w:t>Что просит ответчик:</w:t>
+      </w:r>
+    </w:p>
+    <w:p>
+      <w:pPr>
+        <w:ind w:firstLine="709"/>
+      </w:pPr>
+      <w:r>
+        <w:rPr>
+          <w:rFonts w:ascii="Times New Roman" w:hAnsi="Times New Roman" w:cs="Times New Roman" w:eastAsia="Times New Roman"/>
+          <w:b w:val="0"/>
+          <w:i w:val="0"/>
+          <w:color w:val="000000"/>
+          <w:sz w:val="22"/>
+        </w:rPr>
+        <w:t>Истребовать указанные сведения и материалы у ГУ МВД России по г. Москве.</w:t>
+      </w:r>
+    </w:p>
+    <w:p>
+      <w:pPr>
+        <w:pStyle w:val="Heading2"/>
+      </w:pPr>
+      <w:r>
+        <w:rPr>
+          <w:rFonts w:ascii="Times New Roman" w:hAnsi="Times New Roman" w:cs="Times New Roman" w:eastAsia="Times New Roman"/>
+          <w:b/>
+          <w:i w:val="0"/>
+          <w:color w:val="000000"/>
+          <w:sz w:val="25"/>
+        </w:rPr>
+        <w:t>7. НСИС и РСА</w:t>
       </w:r>
     </w:p>
     <w:p>

</xml_diff>